<commit_message>
feat(sam): add gap report to tier assessment
List each no or partly answer with the step that closes it. The web
page builds the report live, the workbook has a filterable Gap report
sheet, and the Word file carries the table to fill in by hand.

Fixes #6

Co-Authored-By: Claude Sonnet 5.5 <noreply@anthropic.com>
Claude-Session: https://claude.ai/code/session_01XjzbFX8BVBbwU7jJMPUWj5
</commit_message>
<xml_diff>
--- a/site/docs/sam-toolkit/tier-self-assessment.docx
+++ b/site/docs/sam-toolkit/tier-self-assessment.docx
@@ -3020,6 +3020,1585 @@
       <w:r>
         <w:t xml:space="preserve">Your assumed tier: the highest tier you met, where every tier below it is also met. If tier 1 is not met, you are below tier 1.</w:t>
       </w:r>
+    </w:p>
+    <w:p>
+      <w:pPr>
+        <w:pStyle w:val="Heading2"/>
+      </w:pPr>
+      <w:r>
+        <w:t xml:space="preserve">Gap report</w:t>
+      </w:r>
+    </w:p>
+    <w:p>
+      <w:r>
+        <w:t xml:space="preserve">List every question you answered "no" or "partly", with the step that closes it. The web page builds this from your answers, and the Excel workbook has a Gap report sheet you can filter. In Word, write your answer in the third column and delete the rows you do not need.</w:t>
+      </w:r>
+    </w:p>
+    <w:tbl>
+      <w:tblPr>
+        <w:tblW w:w="10080" w:type="dxa"/>
+        <w:tblBorders>
+          <w:top w:val="single" w:sz="4" w:space="0" w:color="808080"/>
+          <w:left w:val="single" w:sz="4" w:space="0" w:color="808080"/>
+          <w:bottom w:val="single" w:sz="4" w:space="0" w:color="808080"/>
+          <w:right w:val="single" w:sz="4" w:space="0" w:color="808080"/>
+          <w:insideH w:val="single" w:sz="4" w:space="0" w:color="808080"/>
+          <w:insideV w:val="single" w:sz="4" w:space="0" w:color="808080"/>
+        </w:tblBorders>
+        <w:tblLayout w:type="fixed"/>
+        <w:tblCellMar>
+          <w:top w:w="60" w:type="dxa"/>
+          <w:left w:w="100" w:type="dxa"/>
+          <w:bottom w:w="60" w:type="dxa"/>
+          <w:right w:w="100" w:type="dxa"/>
+        </w:tblCellMar>
+      </w:tblPr>
+      <w:tblGrid>
+        <w:gridCol w:w="1680"/>
+        <w:gridCol w:w="1680"/>
+        <w:gridCol w:w="1680"/>
+        <w:gridCol w:w="1680"/>
+        <w:gridCol w:w="1680"/>
+        <w:gridCol w:w="1680"/>
+      </w:tblGrid>
+      <w:tr>
+        <w:trPr>
+          <w:cantSplit/>
+          <w:tblHeader/>
+        </w:trPr>
+        <w:tc>
+          <w:tcPr>
+            <w:tcW w:w="1680" w:type="dxa"/>
+            <w:shd w:val="clear" w:color="auto" w:fill="D9E2E7"/>
+          </w:tcPr>
+          <w:p>
+            <w:pPr>
+              <w:spacing w:after="0"/>
+            </w:pPr>
+            <w:r>
+              <w:rPr>
+                <w:b/>
+              </w:rPr>
+              <w:t xml:space="preserve">#</w:t>
+            </w:r>
+          </w:p>
+        </w:tc>
+        <w:tc>
+          <w:tcPr>
+            <w:tcW w:w="1680" w:type="dxa"/>
+            <w:shd w:val="clear" w:color="auto" w:fill="D9E2E7"/>
+          </w:tcPr>
+          <w:p>
+            <w:pPr>
+              <w:spacing w:after="0"/>
+            </w:pPr>
+            <w:r>
+              <w:rPr>
+                <w:b/>
+              </w:rPr>
+              <w:t xml:space="preserve">Question</w:t>
+            </w:r>
+          </w:p>
+        </w:tc>
+        <w:tc>
+          <w:tcPr>
+            <w:tcW w:w="1680" w:type="dxa"/>
+            <w:shd w:val="clear" w:color="auto" w:fill="D9E2E7"/>
+          </w:tcPr>
+          <w:p>
+            <w:pPr>
+              <w:spacing w:after="0"/>
+            </w:pPr>
+            <w:r>
+              <w:rPr>
+                <w:b/>
+              </w:rPr>
+              <w:t xml:space="preserve">Your answer</w:t>
+            </w:r>
+          </w:p>
+        </w:tc>
+        <w:tc>
+          <w:tcPr>
+            <w:tcW w:w="1680" w:type="dxa"/>
+            <w:shd w:val="clear" w:color="auto" w:fill="D9E2E7"/>
+          </w:tcPr>
+          <w:p>
+            <w:pPr>
+              <w:spacing w:after="0"/>
+            </w:pPr>
+            <w:r>
+              <w:rPr>
+                <w:b/>
+              </w:rPr>
+              <w:t xml:space="preserve">What closes the gap</w:t>
+            </w:r>
+          </w:p>
+        </w:tc>
+        <w:tc>
+          <w:tcPr>
+            <w:tcW w:w="1680" w:type="dxa"/>
+            <w:shd w:val="clear" w:color="auto" w:fill="D9E2E7"/>
+          </w:tcPr>
+          <w:p>
+            <w:pPr>
+              <w:spacing w:after="0"/>
+            </w:pPr>
+            <w:r>
+              <w:rPr>
+                <w:b/>
+              </w:rPr>
+              <w:t xml:space="preserve">Owner</w:t>
+            </w:r>
+          </w:p>
+        </w:tc>
+        <w:tc>
+          <w:tcPr>
+            <w:tcW w:w="1680" w:type="dxa"/>
+            <w:shd w:val="clear" w:color="auto" w:fill="D9E2E7"/>
+          </w:tcPr>
+          <w:p>
+            <w:pPr>
+              <w:spacing w:after="0"/>
+            </w:pPr>
+            <w:r>
+              <w:rPr>
+                <w:b/>
+              </w:rPr>
+              <w:t xml:space="preserve">Due date</w:t>
+            </w:r>
+          </w:p>
+        </w:tc>
+      </w:tr>
+      <w:tr>
+        <w:trPr>
+          <w:cantSplit/>
+          <w:trHeight w:val="480" w:hRule="atLeast"/>
+        </w:trPr>
+        <w:tc>
+          <w:tcPr>
+            <w:tcW w:w="1680" w:type="dxa"/>
+          </w:tcPr>
+          <w:p>
+            <w:pPr>
+              <w:spacing w:after="0"/>
+            </w:pPr>
+            <w:r>
+              <w:t xml:space="preserve">1.1</w:t>
+            </w:r>
+          </w:p>
+        </w:tc>
+        <w:tc>
+          <w:tcPr>
+            <w:tcW w:w="1680" w:type="dxa"/>
+          </w:tcPr>
+          <w:p>
+            <w:pPr>
+              <w:spacing w:after="0"/>
+            </w:pPr>
+            <w:r>
+              <w:t xml:space="preserve">A record for every asset, with an owner</w:t>
+            </w:r>
+          </w:p>
+        </w:tc>
+        <w:tc>
+          <w:tcPr>
+            <w:tcW w:w="1680" w:type="dxa"/>
+          </w:tcPr>
+          <w:p>
+            <w:pPr>
+              <w:spacing w:after="0"/>
+            </w:pPr>
+          </w:p>
+        </w:tc>
+        <w:tc>
+          <w:tcPr>
+            <w:tcW w:w="1680" w:type="dxa"/>
+          </w:tcPr>
+          <w:p>
+            <w:pPr>
+              <w:spacing w:after="0"/>
+            </w:pPr>
+            <w:r>
+              <w:t xml:space="preserve">Build one record per asset in scope and name an owner for each. Start from the asset record template.</w:t>
+            </w:r>
+          </w:p>
+        </w:tc>
+        <w:tc>
+          <w:tcPr>
+            <w:tcW w:w="1680" w:type="dxa"/>
+          </w:tcPr>
+          <w:p>
+            <w:pPr>
+              <w:spacing w:after="0"/>
+            </w:pPr>
+          </w:p>
+        </w:tc>
+        <w:tc>
+          <w:tcPr>
+            <w:tcW w:w="1680" w:type="dxa"/>
+          </w:tcPr>
+          <w:p>
+            <w:pPr>
+              <w:spacing w:after="0"/>
+            </w:pPr>
+          </w:p>
+        </w:tc>
+      </w:tr>
+      <w:tr>
+        <w:trPr>
+          <w:cantSplit/>
+          <w:trHeight w:val="480" w:hRule="atLeast"/>
+        </w:trPr>
+        <w:tc>
+          <w:tcPr>
+            <w:tcW w:w="1680" w:type="dxa"/>
+          </w:tcPr>
+          <w:p>
+            <w:pPr>
+              <w:spacing w:after="0"/>
+            </w:pPr>
+            <w:r>
+              <w:t xml:space="preserve">1.2</w:t>
+            </w:r>
+          </w:p>
+        </w:tc>
+        <w:tc>
+          <w:tcPr>
+            <w:tcW w:w="1680" w:type="dxa"/>
+          </w:tcPr>
+          <w:p>
+            <w:pPr>
+              <w:spacing w:after="0"/>
+            </w:pPr>
+            <w:r>
+              <w:t xml:space="preserve">Each record says whether the asset is authorized</w:t>
+            </w:r>
+          </w:p>
+        </w:tc>
+        <w:tc>
+          <w:tcPr>
+            <w:tcW w:w="1680" w:type="dxa"/>
+          </w:tcPr>
+          <w:p>
+            <w:pPr>
+              <w:spacing w:after="0"/>
+            </w:pPr>
+          </w:p>
+        </w:tc>
+        <w:tc>
+          <w:tcPr>
+            <w:tcW w:w="1680" w:type="dxa"/>
+          </w:tcPr>
+          <w:p>
+            <w:pPr>
+              <w:spacing w:after="0"/>
+            </w:pPr>
+            <w:r>
+              <w:t xml:space="preserve">Add an authorized yes/no field to every record and fill it from purchase and approval evidence.</w:t>
+            </w:r>
+          </w:p>
+        </w:tc>
+        <w:tc>
+          <w:tcPr>
+            <w:tcW w:w="1680" w:type="dxa"/>
+          </w:tcPr>
+          <w:p>
+            <w:pPr>
+              <w:spacing w:after="0"/>
+            </w:pPr>
+          </w:p>
+        </w:tc>
+        <w:tc>
+          <w:tcPr>
+            <w:tcW w:w="1680" w:type="dxa"/>
+          </w:tcPr>
+          <w:p>
+            <w:pPr>
+              <w:spacing w:after="0"/>
+            </w:pPr>
+          </w:p>
+        </w:tc>
+      </w:tr>
+      <w:tr>
+        <w:trPr>
+          <w:cantSplit/>
+          <w:trHeight w:val="480" w:hRule="atLeast"/>
+        </w:trPr>
+        <w:tc>
+          <w:tcPr>
+            <w:tcW w:w="1680" w:type="dxa"/>
+          </w:tcPr>
+          <w:p>
+            <w:pPr>
+              <w:spacing w:after="0"/>
+            </w:pPr>
+            <w:r>
+              <w:t xml:space="preserve">1.3</w:t>
+            </w:r>
+          </w:p>
+        </w:tc>
+        <w:tc>
+          <w:tcPr>
+            <w:tcW w:w="1680" w:type="dxa"/>
+          </w:tcPr>
+          <w:p>
+            <w:pPr>
+              <w:spacing w:after="0"/>
+            </w:pPr>
+            <w:r>
+              <w:t xml:space="preserve">Records verified against what is installed</w:t>
+            </w:r>
+          </w:p>
+        </w:tc>
+        <w:tc>
+          <w:tcPr>
+            <w:tcW w:w="1680" w:type="dxa"/>
+          </w:tcPr>
+          <w:p>
+            <w:pPr>
+              <w:spacing w:after="0"/>
+            </w:pPr>
+          </w:p>
+        </w:tc>
+        <w:tc>
+          <w:tcPr>
+            <w:tcW w:w="1680" w:type="dxa"/>
+          </w:tcPr>
+          <w:p>
+            <w:pPr>
+              <w:spacing w:after="0"/>
+            </w:pPr>
+            <w:r>
+              <w:t xml:space="preserve">Set a schedule (at least quarterly) to compare records with discovery data, and log the differences found.</w:t>
+            </w:r>
+          </w:p>
+        </w:tc>
+        <w:tc>
+          <w:tcPr>
+            <w:tcW w:w="1680" w:type="dxa"/>
+          </w:tcPr>
+          <w:p>
+            <w:pPr>
+              <w:spacing w:after="0"/>
+            </w:pPr>
+          </w:p>
+        </w:tc>
+        <w:tc>
+          <w:tcPr>
+            <w:tcW w:w="1680" w:type="dxa"/>
+          </w:tcPr>
+          <w:p>
+            <w:pPr>
+              <w:spacing w:after="0"/>
+            </w:pPr>
+          </w:p>
+        </w:tc>
+      </w:tr>
+      <w:tr>
+        <w:trPr>
+          <w:cantSplit/>
+          <w:trHeight w:val="480" w:hRule="atLeast"/>
+        </w:trPr>
+        <w:tc>
+          <w:tcPr>
+            <w:tcW w:w="1680" w:type="dxa"/>
+          </w:tcPr>
+          <w:p>
+            <w:pPr>
+              <w:spacing w:after="0"/>
+            </w:pPr>
+            <w:r>
+              <w:t xml:space="preserve">1.4</w:t>
+            </w:r>
+          </w:p>
+        </w:tc>
+        <w:tc>
+          <w:tcPr>
+            <w:tcW w:w="1680" w:type="dxa"/>
+          </w:tcPr>
+          <w:p>
+            <w:pPr>
+              <w:spacing w:after="0"/>
+            </w:pPr>
+            <w:r>
+              <w:t xml:space="preserve">Entitlement records held</w:t>
+            </w:r>
+          </w:p>
+        </w:tc>
+        <w:tc>
+          <w:tcPr>
+            <w:tcW w:w="1680" w:type="dxa"/>
+          </w:tcPr>
+          <w:p>
+            <w:pPr>
+              <w:spacing w:after="0"/>
+            </w:pPr>
+          </w:p>
+        </w:tc>
+        <w:tc>
+          <w:tcPr>
+            <w:tcW w:w="1680" w:type="dxa"/>
+          </w:tcPr>
+          <w:p>
+            <w:pPr>
+              <w:spacing w:after="0"/>
+            </w:pPr>
+            <w:r>
+              <w:t xml:space="preserve">Collect licenses, contracts, and proofs of purchase into one entitlement list per product.</w:t>
+            </w:r>
+          </w:p>
+        </w:tc>
+        <w:tc>
+          <w:tcPr>
+            <w:tcW w:w="1680" w:type="dxa"/>
+          </w:tcPr>
+          <w:p>
+            <w:pPr>
+              <w:spacing w:after="0"/>
+            </w:pPr>
+          </w:p>
+        </w:tc>
+        <w:tc>
+          <w:tcPr>
+            <w:tcW w:w="1680" w:type="dxa"/>
+          </w:tcPr>
+          <w:p>
+            <w:pPr>
+              <w:spacing w:after="0"/>
+            </w:pPr>
+          </w:p>
+        </w:tc>
+      </w:tr>
+      <w:tr>
+        <w:trPr>
+          <w:cantSplit/>
+          <w:trHeight w:val="480" w:hRule="atLeast"/>
+        </w:trPr>
+        <w:tc>
+          <w:tcPr>
+            <w:tcW w:w="1680" w:type="dxa"/>
+          </w:tcPr>
+          <w:p>
+            <w:pPr>
+              <w:spacing w:after="0"/>
+            </w:pPr>
+            <w:r>
+              <w:t xml:space="preserve">1.5</w:t>
+            </w:r>
+          </w:p>
+        </w:tc>
+        <w:tc>
+          <w:tcPr>
+            <w:tcW w:w="1680" w:type="dxa"/>
+          </w:tcPr>
+          <w:p>
+            <w:pPr>
+              <w:spacing w:after="0"/>
+            </w:pPr>
+            <w:r>
+              <w:t xml:space="preserve">Entitlements compared with usage</w:t>
+            </w:r>
+          </w:p>
+        </w:tc>
+        <w:tc>
+          <w:tcPr>
+            <w:tcW w:w="1680" w:type="dxa"/>
+          </w:tcPr>
+          <w:p>
+            <w:pPr>
+              <w:spacing w:after="0"/>
+            </w:pPr>
+          </w:p>
+        </w:tc>
+        <w:tc>
+          <w:tcPr>
+            <w:tcW w:w="1680" w:type="dxa"/>
+          </w:tcPr>
+          <w:p>
+            <w:pPr>
+              <w:spacing w:after="0"/>
+            </w:pPr>
+            <w:r>
+              <w:t xml:space="preserve">Run the license position workbook on a schedule and give each shortfall or surplus an owner.</w:t>
+            </w:r>
+          </w:p>
+        </w:tc>
+        <w:tc>
+          <w:tcPr>
+            <w:tcW w:w="1680" w:type="dxa"/>
+          </w:tcPr>
+          <w:p>
+            <w:pPr>
+              <w:spacing w:after="0"/>
+            </w:pPr>
+          </w:p>
+        </w:tc>
+        <w:tc>
+          <w:tcPr>
+            <w:tcW w:w="1680" w:type="dxa"/>
+          </w:tcPr>
+          <w:p>
+            <w:pPr>
+              <w:spacing w:after="0"/>
+            </w:pPr>
+          </w:p>
+        </w:tc>
+      </w:tr>
+      <w:tr>
+        <w:trPr>
+          <w:cantSplit/>
+          <w:trHeight w:val="480" w:hRule="atLeast"/>
+        </w:trPr>
+        <w:tc>
+          <w:tcPr>
+            <w:tcW w:w="1680" w:type="dxa"/>
+          </w:tcPr>
+          <w:p>
+            <w:pPr>
+              <w:spacing w:after="0"/>
+            </w:pPr>
+            <w:r>
+              <w:t xml:space="preserve">1.6</w:t>
+            </w:r>
+          </w:p>
+        </w:tc>
+        <w:tc>
+          <w:tcPr>
+            <w:tcW w:w="1680" w:type="dxa"/>
+          </w:tcPr>
+          <w:p>
+            <w:pPr>
+              <w:spacing w:after="0"/>
+            </w:pPr>
+            <w:r>
+              <w:t xml:space="preserve">A measurable target for data accuracy</w:t>
+            </w:r>
+          </w:p>
+        </w:tc>
+        <w:tc>
+          <w:tcPr>
+            <w:tcW w:w="1680" w:type="dxa"/>
+          </w:tcPr>
+          <w:p>
+            <w:pPr>
+              <w:spacing w:after="0"/>
+            </w:pPr>
+          </w:p>
+        </w:tc>
+        <w:tc>
+          <w:tcPr>
+            <w:tcW w:w="1680" w:type="dxa"/>
+          </w:tcPr>
+          <w:p>
+            <w:pPr>
+              <w:spacing w:after="0"/>
+            </w:pPr>
+            <w:r>
+              <w:t xml:space="preserve">Pick a measurable accuracy target, such as the share of records verified this quarter, and report against it.</w:t>
+            </w:r>
+          </w:p>
+        </w:tc>
+        <w:tc>
+          <w:tcPr>
+            <w:tcW w:w="1680" w:type="dxa"/>
+          </w:tcPr>
+          <w:p>
+            <w:pPr>
+              <w:spacing w:after="0"/>
+            </w:pPr>
+          </w:p>
+        </w:tc>
+        <w:tc>
+          <w:tcPr>
+            <w:tcW w:w="1680" w:type="dxa"/>
+          </w:tcPr>
+          <w:p>
+            <w:pPr>
+              <w:spacing w:after="0"/>
+            </w:pPr>
+          </w:p>
+        </w:tc>
+      </w:tr>
+      <w:tr>
+        <w:trPr>
+          <w:cantSplit/>
+          <w:trHeight w:val="480" w:hRule="atLeast"/>
+        </w:trPr>
+        <w:tc>
+          <w:tcPr>
+            <w:tcW w:w="1680" w:type="dxa"/>
+          </w:tcPr>
+          <w:p>
+            <w:pPr>
+              <w:spacing w:after="0"/>
+            </w:pPr>
+            <w:r>
+              <w:t xml:space="preserve">1.7</w:t>
+            </w:r>
+          </w:p>
+        </w:tc>
+        <w:tc>
+          <w:tcPr>
+            <w:tcW w:w="1680" w:type="dxa"/>
+          </w:tcPr>
+          <w:p>
+            <w:pPr>
+              <w:spacing w:after="0"/>
+            </w:pPr>
+            <w:r>
+              <w:t xml:space="preserve">Changes to the asset record controlled</w:t>
+            </w:r>
+          </w:p>
+        </w:tc>
+        <w:tc>
+          <w:tcPr>
+            <w:tcW w:w="1680" w:type="dxa"/>
+          </w:tcPr>
+          <w:p>
+            <w:pPr>
+              <w:spacing w:after="0"/>
+            </w:pPr>
+          </w:p>
+        </w:tc>
+        <w:tc>
+          <w:tcPr>
+            <w:tcW w:w="1680" w:type="dxa"/>
+          </w:tcPr>
+          <w:p>
+            <w:pPr>
+              <w:spacing w:after="0"/>
+            </w:pPr>
+            <w:r>
+              <w:t xml:space="preserve">Require an authorization entry before any record changes, and log who changed what and when.</w:t>
+            </w:r>
+          </w:p>
+        </w:tc>
+        <w:tc>
+          <w:tcPr>
+            <w:tcW w:w="1680" w:type="dxa"/>
+          </w:tcPr>
+          <w:p>
+            <w:pPr>
+              <w:spacing w:after="0"/>
+            </w:pPr>
+          </w:p>
+        </w:tc>
+        <w:tc>
+          <w:tcPr>
+            <w:tcW w:w="1680" w:type="dxa"/>
+          </w:tcPr>
+          <w:p>
+            <w:pPr>
+              <w:spacing w:after="0"/>
+            </w:pPr>
+          </w:p>
+        </w:tc>
+      </w:tr>
+      <w:tr>
+        <w:trPr>
+          <w:cantSplit/>
+          <w:trHeight w:val="480" w:hRule="atLeast"/>
+        </w:trPr>
+        <w:tc>
+          <w:tcPr>
+            <w:tcW w:w="1680" w:type="dxa"/>
+          </w:tcPr>
+          <w:p>
+            <w:pPr>
+              <w:spacing w:after="0"/>
+            </w:pPr>
+            <w:r>
+              <w:t xml:space="preserve">1.8</w:t>
+            </w:r>
+          </w:p>
+        </w:tc>
+        <w:tc>
+          <w:tcPr>
+            <w:tcW w:w="1680" w:type="dxa"/>
+          </w:tcPr>
+          <w:p>
+            <w:pPr>
+              <w:spacing w:after="0"/>
+            </w:pPr>
+            <w:r>
+              <w:t xml:space="preserve">Security applied to the asset data</w:t>
+            </w:r>
+          </w:p>
+        </w:tc>
+        <w:tc>
+          <w:tcPr>
+            <w:tcW w:w="1680" w:type="dxa"/>
+          </w:tcPr>
+          <w:p>
+            <w:pPr>
+              <w:spacing w:after="0"/>
+            </w:pPr>
+          </w:p>
+        </w:tc>
+        <w:tc>
+          <w:tcPr>
+            <w:tcW w:w="1680" w:type="dxa"/>
+          </w:tcPr>
+          <w:p>
+            <w:pPr>
+              <w:spacing w:after="0"/>
+            </w:pPr>
+            <w:r>
+              <w:t xml:space="preserve">Limit who can view and edit the asset data, and review that access on a schedule.</w:t>
+            </w:r>
+          </w:p>
+        </w:tc>
+        <w:tc>
+          <w:tcPr>
+            <w:tcW w:w="1680" w:type="dxa"/>
+          </w:tcPr>
+          <w:p>
+            <w:pPr>
+              <w:spacing w:after="0"/>
+            </w:pPr>
+          </w:p>
+        </w:tc>
+        <w:tc>
+          <w:tcPr>
+            <w:tcW w:w="1680" w:type="dxa"/>
+          </w:tcPr>
+          <w:p>
+            <w:pPr>
+              <w:spacing w:after="0"/>
+            </w:pPr>
+          </w:p>
+        </w:tc>
+      </w:tr>
+      <w:tr>
+        <w:trPr>
+          <w:cantSplit/>
+          <w:trHeight w:val="480" w:hRule="atLeast"/>
+        </w:trPr>
+        <w:tc>
+          <w:tcPr>
+            <w:tcW w:w="1680" w:type="dxa"/>
+          </w:tcPr>
+          <w:p>
+            <w:pPr>
+              <w:spacing w:after="0"/>
+            </w:pPr>
+            <w:r>
+              <w:t xml:space="preserve">2.1</w:t>
+            </w:r>
+          </w:p>
+        </w:tc>
+        <w:tc>
+          <w:tcPr>
+            <w:tcW w:w="1680" w:type="dxa"/>
+          </w:tcPr>
+          <w:p>
+            <w:pPr>
+              <w:spacing w:after="0"/>
+            </w:pPr>
+            <w:r>
+              <w:t xml:space="preserve">Specification and approval before purchase</w:t>
+            </w:r>
+          </w:p>
+        </w:tc>
+        <w:tc>
+          <w:tcPr>
+            <w:tcW w:w="1680" w:type="dxa"/>
+          </w:tcPr>
+          <w:p>
+            <w:pPr>
+              <w:spacing w:after="0"/>
+            </w:pPr>
+          </w:p>
+        </w:tc>
+        <w:tc>
+          <w:tcPr>
+            <w:tcW w:w="1680" w:type="dxa"/>
+          </w:tcPr>
+          <w:p>
+            <w:pPr>
+              <w:spacing w:after="0"/>
+            </w:pPr>
+            <w:r>
+              <w:t xml:space="preserve">Add a request step that records the need and an approval before any purchase.</w:t>
+            </w:r>
+          </w:p>
+        </w:tc>
+        <w:tc>
+          <w:tcPr>
+            <w:tcW w:w="1680" w:type="dxa"/>
+          </w:tcPr>
+          <w:p>
+            <w:pPr>
+              <w:spacing w:after="0"/>
+            </w:pPr>
+          </w:p>
+        </w:tc>
+        <w:tc>
+          <w:tcPr>
+            <w:tcW w:w="1680" w:type="dxa"/>
+          </w:tcPr>
+          <w:p>
+            <w:pPr>
+              <w:spacing w:after="0"/>
+            </w:pPr>
+          </w:p>
+        </w:tc>
+      </w:tr>
+      <w:tr>
+        <w:trPr>
+          <w:cantSplit/>
+          <w:trHeight w:val="480" w:hRule="atLeast"/>
+        </w:trPr>
+        <w:tc>
+          <w:tcPr>
+            <w:tcW w:w="1680" w:type="dxa"/>
+          </w:tcPr>
+          <w:p>
+            <w:pPr>
+              <w:spacing w:after="0"/>
+            </w:pPr>
+            <w:r>
+              <w:t xml:space="preserve">2.2</w:t>
+            </w:r>
+          </w:p>
+        </w:tc>
+        <w:tc>
+          <w:tcPr>
+            <w:tcW w:w="1680" w:type="dxa"/>
+          </w:tcPr>
+          <w:p>
+            <w:pPr>
+              <w:spacing w:after="0"/>
+            </w:pPr>
+            <w:r>
+              <w:t xml:space="preserve">Acquisitions recorded when they happen</w:t>
+            </w:r>
+          </w:p>
+        </w:tc>
+        <w:tc>
+          <w:tcPr>
+            <w:tcW w:w="1680" w:type="dxa"/>
+          </w:tcPr>
+          <w:p>
+            <w:pPr>
+              <w:spacing w:after="0"/>
+            </w:pPr>
+          </w:p>
+        </w:tc>
+        <w:tc>
+          <w:tcPr>
+            <w:tcW w:w="1680" w:type="dxa"/>
+          </w:tcPr>
+          <w:p>
+            <w:pPr>
+              <w:spacing w:after="0"/>
+            </w:pPr>
+            <w:r>
+              <w:t xml:space="preserve">Make creating the asset record a step of buying, not a later cleanup.</w:t>
+            </w:r>
+          </w:p>
+        </w:tc>
+        <w:tc>
+          <w:tcPr>
+            <w:tcW w:w="1680" w:type="dxa"/>
+          </w:tcPr>
+          <w:p>
+            <w:pPr>
+              <w:spacing w:after="0"/>
+            </w:pPr>
+          </w:p>
+        </w:tc>
+        <w:tc>
+          <w:tcPr>
+            <w:tcW w:w="1680" w:type="dxa"/>
+          </w:tcPr>
+          <w:p>
+            <w:pPr>
+              <w:spacing w:after="0"/>
+            </w:pPr>
+          </w:p>
+        </w:tc>
+      </w:tr>
+      <w:tr>
+        <w:trPr>
+          <w:cantSplit/>
+          <w:trHeight w:val="480" w:hRule="atLeast"/>
+        </w:trPr>
+        <w:tc>
+          <w:tcPr>
+            <w:tcW w:w="1680" w:type="dxa"/>
+          </w:tcPr>
+          <w:p>
+            <w:pPr>
+              <w:spacing w:after="0"/>
+            </w:pPr>
+            <w:r>
+              <w:t xml:space="preserve">2.3</w:t>
+            </w:r>
+          </w:p>
+        </w:tc>
+        <w:tc>
+          <w:tcPr>
+            <w:tcW w:w="1680" w:type="dxa"/>
+          </w:tcPr>
+          <w:p>
+            <w:pPr>
+              <w:spacing w:after="0"/>
+            </w:pPr>
+            <w:r>
+              <w:t xml:space="preserve">Release and deployment update the record</w:t>
+            </w:r>
+          </w:p>
+        </w:tc>
+        <w:tc>
+          <w:tcPr>
+            <w:tcW w:w="1680" w:type="dxa"/>
+          </w:tcPr>
+          <w:p>
+            <w:pPr>
+              <w:spacing w:after="0"/>
+            </w:pPr>
+          </w:p>
+        </w:tc>
+        <w:tc>
+          <w:tcPr>
+            <w:tcW w:w="1680" w:type="dxa"/>
+          </w:tcPr>
+          <w:p>
+            <w:pPr>
+              <w:spacing w:after="0"/>
+            </w:pPr>
+            <w:r>
+              <w:t xml:space="preserve">Add a record-update step to the release and deployment checklists.</w:t>
+            </w:r>
+          </w:p>
+        </w:tc>
+        <w:tc>
+          <w:tcPr>
+            <w:tcW w:w="1680" w:type="dxa"/>
+          </w:tcPr>
+          <w:p>
+            <w:pPr>
+              <w:spacing w:after="0"/>
+            </w:pPr>
+          </w:p>
+        </w:tc>
+        <w:tc>
+          <w:tcPr>
+            <w:tcW w:w="1680" w:type="dxa"/>
+          </w:tcPr>
+          <w:p>
+            <w:pPr>
+              <w:spacing w:after="0"/>
+            </w:pPr>
+          </w:p>
+        </w:tc>
+      </w:tr>
+      <w:tr>
+        <w:trPr>
+          <w:cantSplit/>
+          <w:trHeight w:val="480" w:hRule="atLeast"/>
+        </w:trPr>
+        <w:tc>
+          <w:tcPr>
+            <w:tcW w:w="1680" w:type="dxa"/>
+          </w:tcPr>
+          <w:p>
+            <w:pPr>
+              <w:spacing w:after="0"/>
+            </w:pPr>
+            <w:r>
+              <w:t xml:space="preserve">2.4</w:t>
+            </w:r>
+          </w:p>
+        </w:tc>
+        <w:tc>
+          <w:tcPr>
+            <w:tcW w:w="1680" w:type="dxa"/>
+          </w:tcPr>
+          <w:p>
+            <w:pPr>
+              <w:spacing w:after="0"/>
+            </w:pPr>
+            <w:r>
+              <w:t xml:space="preserve">Use monitored, including cost-effectiveness</w:t>
+            </w:r>
+          </w:p>
+        </w:tc>
+        <w:tc>
+          <w:tcPr>
+            <w:tcW w:w="1680" w:type="dxa"/>
+          </w:tcPr>
+          <w:p>
+            <w:pPr>
+              <w:spacing w:after="0"/>
+            </w:pPr>
+          </w:p>
+        </w:tc>
+        <w:tc>
+          <w:tcPr>
+            <w:tcW w:w="1680" w:type="dxa"/>
+          </w:tcPr>
+          <w:p>
+            <w:pPr>
+              <w:spacing w:after="0"/>
+            </w:pPr>
+            <w:r>
+              <w:t xml:space="preserve">Track usage for each major asset and review its cost against its value on a schedule.</w:t>
+            </w:r>
+          </w:p>
+        </w:tc>
+        <w:tc>
+          <w:tcPr>
+            <w:tcW w:w="1680" w:type="dxa"/>
+          </w:tcPr>
+          <w:p>
+            <w:pPr>
+              <w:spacing w:after="0"/>
+            </w:pPr>
+          </w:p>
+        </w:tc>
+        <w:tc>
+          <w:tcPr>
+            <w:tcW w:w="1680" w:type="dxa"/>
+          </w:tcPr>
+          <w:p>
+            <w:pPr>
+              <w:spacing w:after="0"/>
+            </w:pPr>
+          </w:p>
+        </w:tc>
+      </w:tr>
+      <w:tr>
+        <w:trPr>
+          <w:cantSplit/>
+          <w:trHeight w:val="480" w:hRule="atLeast"/>
+        </w:trPr>
+        <w:tc>
+          <w:tcPr>
+            <w:tcW w:w="1680" w:type="dxa"/>
+          </w:tcPr>
+          <w:p>
+            <w:pPr>
+              <w:spacing w:after="0"/>
+            </w:pPr>
+            <w:r>
+              <w:t xml:space="preserve">2.5</w:t>
+            </w:r>
+          </w:p>
+        </w:tc>
+        <w:tc>
+          <w:tcPr>
+            <w:tcW w:w="1680" w:type="dxa"/>
+          </w:tcPr>
+          <w:p>
+            <w:pPr>
+              <w:spacing w:after="0"/>
+            </w:pPr>
+            <w:r>
+              <w:t xml:space="preserve">Retirement is a defined step</w:t>
+            </w:r>
+          </w:p>
+        </w:tc>
+        <w:tc>
+          <w:tcPr>
+            <w:tcW w:w="1680" w:type="dxa"/>
+          </w:tcPr>
+          <w:p>
+            <w:pPr>
+              <w:spacing w:after="0"/>
+            </w:pPr>
+          </w:p>
+        </w:tc>
+        <w:tc>
+          <w:tcPr>
+            <w:tcW w:w="1680" w:type="dxa"/>
+          </w:tcPr>
+          <w:p>
+            <w:pPr>
+              <w:spacing w:after="0"/>
+            </w:pPr>
+            <w:r>
+              <w:t xml:space="preserve">Write a retirement procedure that covers disposal, data removal, and closing the record.</w:t>
+            </w:r>
+          </w:p>
+        </w:tc>
+        <w:tc>
+          <w:tcPr>
+            <w:tcW w:w="1680" w:type="dxa"/>
+          </w:tcPr>
+          <w:p>
+            <w:pPr>
+              <w:spacing w:after="0"/>
+            </w:pPr>
+          </w:p>
+        </w:tc>
+        <w:tc>
+          <w:tcPr>
+            <w:tcW w:w="1680" w:type="dxa"/>
+          </w:tcPr>
+          <w:p>
+            <w:pPr>
+              <w:spacing w:after="0"/>
+            </w:pPr>
+          </w:p>
+        </w:tc>
+      </w:tr>
+      <w:tr>
+        <w:trPr>
+          <w:cantSplit/>
+          <w:trHeight w:val="480" w:hRule="atLeast"/>
+        </w:trPr>
+        <w:tc>
+          <w:tcPr>
+            <w:tcW w:w="1680" w:type="dxa"/>
+          </w:tcPr>
+          <w:p>
+            <w:pPr>
+              <w:spacing w:after="0"/>
+            </w:pPr>
+            <w:r>
+              <w:t xml:space="preserve">2.6</w:t>
+            </w:r>
+          </w:p>
+        </w:tc>
+        <w:tc>
+          <w:tcPr>
+            <w:tcW w:w="1680" w:type="dxa"/>
+          </w:tcPr>
+          <w:p>
+            <w:pPr>
+              <w:spacing w:after="0"/>
+            </w:pPr>
+            <w:r>
+              <w:t xml:space="preserve">Authorizations and their execution logged</w:t>
+            </w:r>
+          </w:p>
+        </w:tc>
+        <w:tc>
+          <w:tcPr>
+            <w:tcW w:w="1680" w:type="dxa"/>
+          </w:tcPr>
+          <w:p>
+            <w:pPr>
+              <w:spacing w:after="0"/>
+            </w:pPr>
+          </w:p>
+        </w:tc>
+        <w:tc>
+          <w:tcPr>
+            <w:tcW w:w="1680" w:type="dxa"/>
+          </w:tcPr>
+          <w:p>
+            <w:pPr>
+              <w:spacing w:after="0"/>
+            </w:pPr>
+            <w:r>
+              <w:t xml:space="preserve">Use the authorization log template for approvals and for who carried them out.</w:t>
+            </w:r>
+          </w:p>
+        </w:tc>
+        <w:tc>
+          <w:tcPr>
+            <w:tcW w:w="1680" w:type="dxa"/>
+          </w:tcPr>
+          <w:p>
+            <w:pPr>
+              <w:spacing w:after="0"/>
+            </w:pPr>
+          </w:p>
+        </w:tc>
+        <w:tc>
+          <w:tcPr>
+            <w:tcW w:w="1680" w:type="dxa"/>
+          </w:tcPr>
+          <w:p>
+            <w:pPr>
+              <w:spacing w:after="0"/>
+            </w:pPr>
+          </w:p>
+        </w:tc>
+      </w:tr>
+      <w:tr>
+        <w:trPr>
+          <w:cantSplit/>
+          <w:trHeight w:val="480" w:hRule="atLeast"/>
+        </w:trPr>
+        <w:tc>
+          <w:tcPr>
+            <w:tcW w:w="1680" w:type="dxa"/>
+          </w:tcPr>
+          <w:p>
+            <w:pPr>
+              <w:spacing w:after="0"/>
+            </w:pPr>
+            <w:r>
+              <w:t xml:space="preserve">3.1</w:t>
+            </w:r>
+          </w:p>
+        </w:tc>
+        <w:tc>
+          <w:tcPr>
+            <w:tcW w:w="1680" w:type="dxa"/>
+          </w:tcPr>
+          <w:p>
+            <w:pPr>
+              <w:spacing w:after="0"/>
+            </w:pPr>
+            <w:r>
+              <w:t xml:space="preserve">Suppliers and contracts managed</w:t>
+            </w:r>
+          </w:p>
+        </w:tc>
+        <w:tc>
+          <w:tcPr>
+            <w:tcW w:w="1680" w:type="dxa"/>
+          </w:tcPr>
+          <w:p>
+            <w:pPr>
+              <w:spacing w:after="0"/>
+            </w:pPr>
+          </w:p>
+        </w:tc>
+        <w:tc>
+          <w:tcPr>
+            <w:tcW w:w="1680" w:type="dxa"/>
+          </w:tcPr>
+          <w:p>
+            <w:pPr>
+              <w:spacing w:after="0"/>
+            </w:pPr>
+            <w:r>
+              <w:t xml:space="preserve">Keep a vendor and contract register, and check compliance with contract terms as well as licensing.</w:t>
+            </w:r>
+          </w:p>
+        </w:tc>
+        <w:tc>
+          <w:tcPr>
+            <w:tcW w:w="1680" w:type="dxa"/>
+          </w:tcPr>
+          <w:p>
+            <w:pPr>
+              <w:spacing w:after="0"/>
+            </w:pPr>
+          </w:p>
+        </w:tc>
+        <w:tc>
+          <w:tcPr>
+            <w:tcW w:w="1680" w:type="dxa"/>
+          </w:tcPr>
+          <w:p>
+            <w:pPr>
+              <w:spacing w:after="0"/>
+            </w:pPr>
+          </w:p>
+        </w:tc>
+      </w:tr>
+      <w:tr>
+        <w:trPr>
+          <w:cantSplit/>
+          <w:trHeight w:val="480" w:hRule="atLeast"/>
+        </w:trPr>
+        <w:tc>
+          <w:tcPr>
+            <w:tcW w:w="1680" w:type="dxa"/>
+          </w:tcPr>
+          <w:p>
+            <w:pPr>
+              <w:spacing w:after="0"/>
+            </w:pPr>
+            <w:r>
+              <w:t xml:space="preserve">3.2</w:t>
+            </w:r>
+          </w:p>
+        </w:tc>
+        <w:tc>
+          <w:tcPr>
+            <w:tcW w:w="1680" w:type="dxa"/>
+          </w:tcPr>
+          <w:p>
+            <w:pPr>
+              <w:spacing w:after="0"/>
+            </w:pPr>
+            <w:r>
+              <w:t xml:space="preserve">Costs and values tied to budgets</w:t>
+            </w:r>
+          </w:p>
+        </w:tc>
+        <w:tc>
+          <w:tcPr>
+            <w:tcW w:w="1680" w:type="dxa"/>
+          </w:tcPr>
+          <w:p>
+            <w:pPr>
+              <w:spacing w:after="0"/>
+            </w:pPr>
+          </w:p>
+        </w:tc>
+        <w:tc>
+          <w:tcPr>
+            <w:tcW w:w="1680" w:type="dxa"/>
+          </w:tcPr>
+          <w:p>
+            <w:pPr>
+              <w:spacing w:after="0"/>
+            </w:pPr>
+            <w:r>
+              <w:t xml:space="preserve">Record the cost and value of each asset and tie them to budget lines.</w:t>
+            </w:r>
+          </w:p>
+        </w:tc>
+        <w:tc>
+          <w:tcPr>
+            <w:tcW w:w="1680" w:type="dxa"/>
+          </w:tcPr>
+          <w:p>
+            <w:pPr>
+              <w:spacing w:after="0"/>
+            </w:pPr>
+          </w:p>
+        </w:tc>
+        <w:tc>
+          <w:tcPr>
+            <w:tcW w:w="1680" w:type="dxa"/>
+          </w:tcPr>
+          <w:p>
+            <w:pPr>
+              <w:spacing w:after="0"/>
+            </w:pPr>
+          </w:p>
+        </w:tc>
+      </w:tr>
+      <w:tr>
+        <w:trPr>
+          <w:cantSplit/>
+          <w:trHeight w:val="480" w:hRule="atLeast"/>
+        </w:trPr>
+        <w:tc>
+          <w:tcPr>
+            <w:tcW w:w="1680" w:type="dxa"/>
+          </w:tcPr>
+          <w:p>
+            <w:pPr>
+              <w:spacing w:after="0"/>
+            </w:pPr>
+            <w:r>
+              <w:t xml:space="preserve">3.3</w:t>
+            </w:r>
+          </w:p>
+        </w:tc>
+        <w:tc>
+          <w:tcPr>
+            <w:tcW w:w="1680" w:type="dxa"/>
+          </w:tcPr>
+          <w:p>
+            <w:pPr>
+              <w:spacing w:after="0"/>
+            </w:pPr>
+            <w:r>
+              <w:t xml:space="preserve">Service levels defined</w:t>
+            </w:r>
+          </w:p>
+        </w:tc>
+        <w:tc>
+          <w:tcPr>
+            <w:tcW w:w="1680" w:type="dxa"/>
+          </w:tcPr>
+          <w:p>
+            <w:pPr>
+              <w:spacing w:after="0"/>
+            </w:pPr>
+          </w:p>
+        </w:tc>
+        <w:tc>
+          <w:tcPr>
+            <w:tcW w:w="1680" w:type="dxa"/>
+          </w:tcPr>
+          <w:p>
+            <w:pPr>
+              <w:spacing w:after="0"/>
+            </w:pPr>
+            <w:r>
+              <w:t xml:space="preserve">List the services ITAM depends on and record the agreed service level for each.</w:t>
+            </w:r>
+          </w:p>
+        </w:tc>
+        <w:tc>
+          <w:tcPr>
+            <w:tcW w:w="1680" w:type="dxa"/>
+          </w:tcPr>
+          <w:p>
+            <w:pPr>
+              <w:spacing w:after="0"/>
+            </w:pPr>
+          </w:p>
+        </w:tc>
+        <w:tc>
+          <w:tcPr>
+            <w:tcW w:w="1680" w:type="dxa"/>
+          </w:tcPr>
+          <w:p>
+            <w:pPr>
+              <w:spacing w:after="0"/>
+            </w:pPr>
+          </w:p>
+        </w:tc>
+      </w:tr>
+      <w:tr>
+        <w:trPr>
+          <w:cantSplit/>
+          <w:trHeight w:val="480" w:hRule="atLeast"/>
+        </w:trPr>
+        <w:tc>
+          <w:tcPr>
+            <w:tcW w:w="1680" w:type="dxa"/>
+          </w:tcPr>
+          <w:p>
+            <w:pPr>
+              <w:spacing w:after="0"/>
+            </w:pPr>
+            <w:r>
+              <w:t xml:space="preserve">3.4</w:t>
+            </w:r>
+          </w:p>
+        </w:tc>
+        <w:tc>
+          <w:tcPr>
+            <w:tcW w:w="1680" w:type="dxa"/>
+          </w:tcPr>
+          <w:p>
+            <w:pPr>
+              <w:spacing w:after="0"/>
+            </w:pPr>
+            <w:r>
+              <w:t xml:space="preserve">Other risks managed</w:t>
+            </w:r>
+          </w:p>
+        </w:tc>
+        <w:tc>
+          <w:tcPr>
+            <w:tcW w:w="1680" w:type="dxa"/>
+          </w:tcPr>
+          <w:p>
+            <w:pPr>
+              <w:spacing w:after="0"/>
+            </w:pPr>
+          </w:p>
+        </w:tc>
+        <w:tc>
+          <w:tcPr>
+            <w:tcW w:w="1680" w:type="dxa"/>
+          </w:tcPr>
+          <w:p>
+            <w:pPr>
+              <w:spacing w:after="0"/>
+            </w:pPr>
+            <w:r>
+              <w:t xml:space="preserve">Run an ITAM risk assessment, record the treatment for each risk, and check that it worked.</w:t>
+            </w:r>
+          </w:p>
+        </w:tc>
+        <w:tc>
+          <w:tcPr>
+            <w:tcW w:w="1680" w:type="dxa"/>
+          </w:tcPr>
+          <w:p>
+            <w:pPr>
+              <w:spacing w:after="0"/>
+            </w:pPr>
+          </w:p>
+        </w:tc>
+        <w:tc>
+          <w:tcPr>
+            <w:tcW w:w="1680" w:type="dxa"/>
+          </w:tcPr>
+          <w:p>
+            <w:pPr>
+              <w:spacing w:after="0"/>
+            </w:pPr>
+          </w:p>
+        </w:tc>
+      </w:tr>
+      <w:tr>
+        <w:trPr>
+          <w:cantSplit/>
+          <w:trHeight w:val="480" w:hRule="atLeast"/>
+        </w:trPr>
+        <w:tc>
+          <w:tcPr>
+            <w:tcW w:w="1680" w:type="dxa"/>
+          </w:tcPr>
+          <w:p>
+            <w:pPr>
+              <w:spacing w:after="0"/>
+            </w:pPr>
+            <w:r>
+              <w:t xml:space="preserve">3.5</w:t>
+            </w:r>
+          </w:p>
+        </w:tc>
+        <w:tc>
+          <w:tcPr>
+            <w:tcW w:w="1680" w:type="dxa"/>
+          </w:tcPr>
+          <w:p>
+            <w:pPr>
+              <w:spacing w:after="0"/>
+            </w:pPr>
+            <w:r>
+              <w:t xml:space="preserve">Performance measured and reported</w:t>
+            </w:r>
+          </w:p>
+        </w:tc>
+        <w:tc>
+          <w:tcPr>
+            <w:tcW w:w="1680" w:type="dxa"/>
+          </w:tcPr>
+          <w:p>
+            <w:pPr>
+              <w:spacing w:after="0"/>
+            </w:pPr>
+          </w:p>
+        </w:tc>
+        <w:tc>
+          <w:tcPr>
+            <w:tcW w:w="1680" w:type="dxa"/>
+          </w:tcPr>
+          <w:p>
+            <w:pPr>
+              <w:spacing w:after="0"/>
+            </w:pPr>
+            <w:r>
+              <w:t xml:space="preserve">Define financial and non-financial ITAM measures and report them to management on a schedule.</w:t>
+            </w:r>
+          </w:p>
+        </w:tc>
+        <w:tc>
+          <w:tcPr>
+            <w:tcW w:w="1680" w:type="dxa"/>
+          </w:tcPr>
+          <w:p>
+            <w:pPr>
+              <w:spacing w:after="0"/>
+            </w:pPr>
+          </w:p>
+        </w:tc>
+        <w:tc>
+          <w:tcPr>
+            <w:tcW w:w="1680" w:type="dxa"/>
+          </w:tcPr>
+          <w:p>
+            <w:pPr>
+              <w:spacing w:after="0"/>
+            </w:pPr>
+          </w:p>
+        </w:tc>
+      </w:tr>
+    </w:tbl>
+    <w:p>
+      <w:pPr>
+        <w:spacing w:after="0"/>
+      </w:pPr>
     </w:p>
     <w:p>
       <w:pPr>

</xml_diff>

<commit_message>
fix(sam): add owner note to tier question 1.1
Tell readers to answer Partly when any record lacks an owner.

Fixes #13

Co-Authored-By: Claude Sonnet 5.5 <noreply@anthropic.com>
Claude-Session: https://claude.ai/code/session_01XjzbFX8BVBbwU7jJMPUWj5
</commit_message>
<xml_diff>
--- a/site/docs/sam-toolkit/tier-self-assessment.docx
+++ b/site/docs/sam-toolkit/tier-self-assessment.docx
@@ -170,7 +170,16 @@
               <w:spacing w:after="0"/>
             </w:pPr>
             <w:r>
-              <w:t xml:space="preserve">Is there a record for every software and hardware asset in scope, with an owner? (8.3, 7.6.2)</w:t>
+              <w:t xml:space="preserve">Is there a record for every software and hardware asset in scope, with an owner? (8.3, 7.6.2) </w:t>
+            </w:r>
+            <w:r>
+              <w:rPr>
+                <w:b/>
+              </w:rPr>
+              <w:t xml:space="preserve">NOTE:</w:t>
+            </w:r>
+            <w:r>
+              <w:t xml:space="preserve"> if owner is missing for any, choose Partly</w:t>
             </w:r>
           </w:p>
         </w:tc>

</xml_diff>